<commit_message>
Add Nature's Valley experience to portfolio
</commit_message>
<xml_diff>
--- a/Joshua_Nehohwa_CV.docx
+++ b/Joshua_Nehohwa_CV.docx
@@ -29,7 +29,7 @@
           <w:color w:val="0F766E"/>
           <w:sz w:val="21"/>
         </w:rPr>
-        <w:t>Software Engineering Student | Junior Software Developer</w:t>
+        <w:t>Software Engineering Student | Junior Software Developer | Eduvos Tutor</w:t>
       </w:r>
     </w:p>
     <w:p>
@@ -72,7 +72,7 @@
           <w:color w:val="374151"/>
           <w:sz w:val="19"/>
         </w:rPr>
-        <w:t>Software Engineering student and junior developer with experience across React/Next.js, TypeScript, Python, PHP/MySQL, Supabase, cloud fundamentals, and AI data evaluation. Strong academic performer with an 86% average, chairperson of Vossie DevClub, and practical experience leading technical workshops, building product prototypes, and working remotely with detailed AI annotation guidelines.</w:t>
+        <w:t>Software Engineering student and junior developer with experience across React/Next.js, TypeScript, Python, PHP/MySQL, Supabase, cloud fundamentals, and AI data evaluation. Strong academic performer with an 86% average, chairperson of Vossie DevClub, and current Eduvos tutor for ITMTA1-B22 students. Practical experience leading tutorial sessions, supporting Nature's Valley community IT and youth-ambassador coordination, building product prototypes, and working remotely with detailed AI annotation guidelines.</w:t>
       </w:r>
     </w:p>
     <w:p>
@@ -208,6 +208,155 @@
           <w:sz w:val="18"/>
         </w:rPr>
         <w:t xml:space="preserve"> | PostgreSQL, MySQL, Supabase, AWS EC2, S3, IAM, Lambda</w:t>
+      </w:r>
+    </w:p>
+    <w:p>
+      <w:pPr>
+        <w:spacing w:before="200" w:after="80"/>
+      </w:pPr>
+      <w:r>
+        <w:rPr>
+          <w:rFonts w:ascii="Calibri" w:hAnsi="Calibri"/>
+          <w:b/>
+          <w:color w:val="0F766E"/>
+          <w:sz w:val="21"/>
+        </w:rPr>
+        <w:t>CURRENT TUTORING EXPERIENCE</w:t>
+      </w:r>
+    </w:p>
+    <w:p>
+      <w:pPr>
+        <w:spacing w:after="20"/>
+      </w:pPr>
+      <w:r>
+        <w:rPr>
+          <w:rFonts w:ascii="Calibri" w:hAnsi="Calibri"/>
+          <w:b/>
+          <w:color w:val="111827"/>
+          <w:sz w:val="21"/>
+        </w:rPr>
+        <w:t>ITMTA1-B22 Tutor, Eduvos University</w:t>
+      </w:r>
+      <w:r>
+        <w:rPr>
+          <w:rFonts w:ascii="Calibri" w:hAnsi="Calibri"/>
+          <w:b w:val="0"/>
+          <w:color w:val="4B5563"/>
+          <w:sz w:val="18"/>
+        </w:rPr>
+        <w:t xml:space="preserve"> | Mowbray / Online | May 2026 - Present</w:t>
+      </w:r>
+    </w:p>
+    <w:p>
+      <w:pPr>
+        <w:pStyle w:val="ListBullet"/>
+        <w:spacing w:after="20"/>
+      </w:pPr>
+      <w:r>
+        <w:rPr>
+          <w:rFonts w:ascii="Calibri" w:hAnsi="Calibri"/>
+          <w:b w:val="0"/>
+          <w:color w:val="374151"/>
+          <w:sz w:val="18"/>
+        </w:rPr>
+        <w:t>Lead weekly two-hour Teams tutorial sessions for ITMTA1-B22 students with full-slot availability.</w:t>
+      </w:r>
+    </w:p>
+    <w:p>
+      <w:pPr>
+        <w:pStyle w:val="ListBullet"/>
+        <w:spacing w:after="20"/>
+      </w:pPr>
+      <w:r>
+        <w:rPr>
+          <w:rFonts w:ascii="Calibri" w:hAnsi="Calibri"/>
+          <w:b w:val="0"/>
+          <w:color w:val="374151"/>
+          <w:sz w:val="18"/>
+        </w:rPr>
+        <w:t>Provided live exam-logistics support during the June 19, 2026 ITMTA1-B22 Teams tutorial session.</w:t>
+      </w:r>
+    </w:p>
+    <w:p>
+      <w:pPr>
+        <w:pStyle w:val="ListBullet"/>
+        <w:spacing w:after="20"/>
+      </w:pPr>
+      <w:r>
+        <w:rPr>
+          <w:rFonts w:ascii="Calibri" w:hAnsi="Calibri"/>
+          <w:b w:val="0"/>
+          <w:color w:val="374151"/>
+          <w:sz w:val="18"/>
+        </w:rPr>
+        <w:t>Coordinate tutoring availability with Eduvos staff and track tutoring hours for the weekly allocation.</w:t>
+      </w:r>
+    </w:p>
+    <w:p>
+      <w:pPr>
+        <w:spacing w:before="200" w:after="80"/>
+      </w:pPr>
+      <w:r>
+        <w:rPr>
+          <w:rFonts w:ascii="Calibri" w:hAnsi="Calibri"/>
+          <w:b/>
+          <w:color w:val="0F766E"/>
+          <w:sz w:val="21"/>
+        </w:rPr>
+        <w:t>CURRENT COMMUNITY EXPERIENCE</w:t>
+      </w:r>
+    </w:p>
+    <w:p>
+      <w:pPr>
+        <w:spacing w:after="20"/>
+      </w:pPr>
+      <w:r>
+        <w:rPr>
+          <w:rFonts w:ascii="Calibri" w:hAnsi="Calibri"/>
+          <w:b/>
+          <w:color w:val="111827"/>
+          <w:sz w:val="21"/>
+        </w:rPr>
+        <w:t>Nature's Valley Trust Community IT and Youth Ambassador Support</w:t>
+      </w:r>
+      <w:r>
+        <w:rPr>
+          <w:rFonts w:ascii="Calibri" w:hAnsi="Calibri"/>
+          <w:b w:val="0"/>
+          <w:color w:val="4B5563"/>
+          <w:sz w:val="18"/>
+        </w:rPr>
+        <w:t xml:space="preserve"> | Nature's Valley, South Africa | June 2026</w:t>
+      </w:r>
+    </w:p>
+    <w:p>
+      <w:pPr>
+        <w:pStyle w:val="ListBullet"/>
+        <w:spacing w:after="20"/>
+      </w:pPr>
+      <w:r>
+        <w:rPr>
+          <w:rFonts w:ascii="Calibri" w:hAnsi="Calibri"/>
+          <w:b w:val="0"/>
+          <w:color w:val="374151"/>
+          <w:sz w:val="18"/>
+        </w:rPr>
+        <w:t>Support Gavin on KuCoNa IT installation during Nature's Valley Trust coordination.</w:t>
+      </w:r>
+    </w:p>
+    <w:p>
+      <w:pPr>
+        <w:pStyle w:val="ListBullet"/>
+        <w:spacing w:after="20"/>
+      </w:pPr>
+      <w:r>
+        <w:rPr>
+          <w:rFonts w:ascii="Calibri" w:hAnsi="Calibri"/>
+          <w:b w:val="0"/>
+          <w:color w:val="374151"/>
+          <w:sz w:val="18"/>
+        </w:rPr>
+        <w:t>Coordinate with Andrew to meet 10 youth ambassadors ahead of their July 1, 2026 start.</w:t>
       </w:r>
     </w:p>
     <w:p>

</xml_diff>

<commit_message>
Tighten Eduvos tutoring portfolio update
</commit_message>
<xml_diff>
--- a/Joshua_Nehohwa_CV.docx
+++ b/Joshua_Nehohwa_CV.docx
@@ -72,7 +72,7 @@
           <w:color w:val="374151"/>
           <w:sz w:val="19"/>
         </w:rPr>
-        <w:t>Software Engineering student and junior developer with experience across React/Next.js, TypeScript, Python, PHP/MySQL, Supabase, cloud fundamentals, and AI data evaluation. Strong academic performer with an 86% average, chairperson of Vossie DevClub, and current Eduvos tutor for ITMTA1-B22 students. Practical experience leading tutorial sessions, supporting Nature's Valley community IT and youth-ambassador coordination, building product prototypes, and working remotely with detailed AI annotation guidelines.</w:t>
+        <w:t>Software Engineering student and junior developer with experience across React/Next.js, TypeScript, Python, PHP/MySQL, Supabase, cloud fundamentals, and AI data evaluation. Strong academic performer with an 86% average, chairperson of Vossie DevClub, and current Eduvos tutor for ITMTA1-B22 students. Practical experience leading tutorial sessions, building product prototypes, and working remotely with detailed AI annotation guidelines.</w:t>
       </w:r>
     </w:p>
     <w:p>
@@ -290,73 +290,6 @@
           <w:sz w:val="18"/>
         </w:rPr>
         <w:t>Coordinate tutoring availability with Eduvos staff and track tutoring hours for the weekly allocation.</w:t>
-      </w:r>
-    </w:p>
-    <w:p>
-      <w:pPr>
-        <w:spacing w:before="200" w:after="80"/>
-      </w:pPr>
-      <w:r>
-        <w:rPr>
-          <w:rFonts w:ascii="Calibri" w:hAnsi="Calibri"/>
-          <w:b/>
-          <w:color w:val="0F766E"/>
-          <w:sz w:val="21"/>
-        </w:rPr>
-        <w:t>CURRENT COMMUNITY EXPERIENCE</w:t>
-      </w:r>
-    </w:p>
-    <w:p>
-      <w:pPr>
-        <w:spacing w:after="20"/>
-      </w:pPr>
-      <w:r>
-        <w:rPr>
-          <w:rFonts w:ascii="Calibri" w:hAnsi="Calibri"/>
-          <w:b/>
-          <w:color w:val="111827"/>
-          <w:sz w:val="21"/>
-        </w:rPr>
-        <w:t>Nature's Valley Trust Community IT and Youth Ambassador Support</w:t>
-      </w:r>
-      <w:r>
-        <w:rPr>
-          <w:rFonts w:ascii="Calibri" w:hAnsi="Calibri"/>
-          <w:b w:val="0"/>
-          <w:color w:val="4B5563"/>
-          <w:sz w:val="18"/>
-        </w:rPr>
-        <w:t xml:space="preserve"> | Nature's Valley, South Africa | June 2026</w:t>
-      </w:r>
-    </w:p>
-    <w:p>
-      <w:pPr>
-        <w:pStyle w:val="ListBullet"/>
-        <w:spacing w:after="20"/>
-      </w:pPr>
-      <w:r>
-        <w:rPr>
-          <w:rFonts w:ascii="Calibri" w:hAnsi="Calibri"/>
-          <w:b w:val="0"/>
-          <w:color w:val="374151"/>
-          <w:sz w:val="18"/>
-        </w:rPr>
-        <w:t>Support Gavin on KuCoNa IT installation during Nature's Valley Trust coordination.</w:t>
-      </w:r>
-    </w:p>
-    <w:p>
-      <w:pPr>
-        <w:pStyle w:val="ListBullet"/>
-        <w:spacing w:after="20"/>
-      </w:pPr>
-      <w:r>
-        <w:rPr>
-          <w:rFonts w:ascii="Calibri" w:hAnsi="Calibri"/>
-          <w:b w:val="0"/>
-          <w:color w:val="374151"/>
-          <w:sz w:val="18"/>
-        </w:rPr>
-        <w:t>Coordinate with Andrew to meet 10 youth ambassadors ahead of their July 1, 2026 start.</w:t>
       </w:r>
     </w:p>
     <w:p>

</xml_diff>

<commit_message>
Restore Nature's Valley portfolio update
</commit_message>
<xml_diff>
--- a/Joshua_Nehohwa_CV.docx
+++ b/Joshua_Nehohwa_CV.docx
@@ -72,7 +72,7 @@
           <w:color w:val="374151"/>
           <w:sz w:val="19"/>
         </w:rPr>
-        <w:t>Software Engineering student and junior developer with experience across React/Next.js, TypeScript, Python, PHP/MySQL, Supabase, cloud fundamentals, and AI data evaluation. Strong academic performer with an 86% average, chairperson of Vossie DevClub, and current Eduvos tutor for ITMTA1-B22 students. Practical experience leading tutorial sessions, building product prototypes, and working remotely with detailed AI annotation guidelines.</w:t>
+        <w:t>Software Engineering student and junior developer with experience across React/Next.js, TypeScript, Python, PHP/MySQL, Supabase, cloud fundamentals, and AI data evaluation. Strong academic performer with an 86% average, chairperson of Vossie DevClub, and current Eduvos tutor for ITMTA1-B22 students. Practical experience leading tutorial sessions, supporting Nature's Valley community IT and youth-ambassador coordination, building product prototypes, and working remotely with detailed AI annotation guidelines.</w:t>
       </w:r>
     </w:p>
     <w:p>
@@ -290,6 +290,73 @@
           <w:sz w:val="18"/>
         </w:rPr>
         <w:t>Coordinate tutoring availability with Eduvos staff and track tutoring hours for the weekly allocation.</w:t>
+      </w:r>
+    </w:p>
+    <w:p>
+      <w:pPr>
+        <w:spacing w:before="200" w:after="80"/>
+      </w:pPr>
+      <w:r>
+        <w:rPr>
+          <w:rFonts w:ascii="Calibri" w:hAnsi="Calibri"/>
+          <w:b/>
+          <w:color w:val="0F766E"/>
+          <w:sz w:val="21"/>
+        </w:rPr>
+        <w:t>CURRENT COMMUNITY EXPERIENCE</w:t>
+      </w:r>
+    </w:p>
+    <w:p>
+      <w:pPr>
+        <w:spacing w:after="20"/>
+      </w:pPr>
+      <w:r>
+        <w:rPr>
+          <w:rFonts w:ascii="Calibri" w:hAnsi="Calibri"/>
+          <w:b/>
+          <w:color w:val="111827"/>
+          <w:sz w:val="21"/>
+        </w:rPr>
+        <w:t>Nature's Valley Trust Community IT and Youth Ambassador Support</w:t>
+      </w:r>
+      <w:r>
+        <w:rPr>
+          <w:rFonts w:ascii="Calibri" w:hAnsi="Calibri"/>
+          <w:b w:val="0"/>
+          <w:color w:val="4B5563"/>
+          <w:sz w:val="18"/>
+        </w:rPr>
+        <w:t xml:space="preserve"> | Nature's Valley, South Africa | June 2026</w:t>
+      </w:r>
+    </w:p>
+    <w:p>
+      <w:pPr>
+        <w:pStyle w:val="ListBullet"/>
+        <w:spacing w:after="20"/>
+      </w:pPr>
+      <w:r>
+        <w:rPr>
+          <w:rFonts w:ascii="Calibri" w:hAnsi="Calibri"/>
+          <w:b w:val="0"/>
+          <w:color w:val="374151"/>
+          <w:sz w:val="18"/>
+        </w:rPr>
+        <w:t>Support Gavin on KuCoNa IT installation during Nature's Valley Trust coordination.</w:t>
+      </w:r>
+    </w:p>
+    <w:p>
+      <w:pPr>
+        <w:pStyle w:val="ListBullet"/>
+        <w:spacing w:after="20"/>
+      </w:pPr>
+      <w:r>
+        <w:rPr>
+          <w:rFonts w:ascii="Calibri" w:hAnsi="Calibri"/>
+          <w:b w:val="0"/>
+          <w:color w:val="374151"/>
+          <w:sz w:val="18"/>
+        </w:rPr>
+        <w:t>Coordinate with Andrew to meet 10 youth ambassadors ahead of their July 1, 2026 start.</w:t>
       </w:r>
     </w:p>
     <w:p>

</xml_diff>

<commit_message>
Remove unrelated community portfolio copy
</commit_message>
<xml_diff>
--- a/Joshua_Nehohwa_CV.docx
+++ b/Joshua_Nehohwa_CV.docx
@@ -72,7 +72,7 @@
           <w:color w:val="374151"/>
           <w:sz w:val="19"/>
         </w:rPr>
-        <w:t>Software Engineering student and junior developer with experience across React/Next.js, TypeScript, Python, PHP/MySQL, Supabase, cloud fundamentals, and AI data evaluation. Strong academic performer with an 86% average, chairperson of Vossie DevClub, and current Eduvos tutor for ITMTA1-B22 students. Practical experience leading tutorial sessions, supporting Nature's Valley community IT and youth-ambassador coordination, building product prototypes, and working remotely with detailed AI annotation guidelines.</w:t>
+        <w:t>Software Engineering student and junior developer with experience across React/Next.js, TypeScript, Python, PHP/MySQL, Supabase, cloud fundamentals, and AI data evaluation. Strong academic performer with an 86% average, chairperson of Vossie DevClub, and current Eduvos tutor for ITMTA1-B22 students. Practical experience leading tutorial sessions, building product prototypes, and working remotely with detailed AI annotation guidelines.</w:t>
       </w:r>
     </w:p>
     <w:p>
@@ -290,73 +290,6 @@
           <w:sz w:val="18"/>
         </w:rPr>
         <w:t>Coordinate tutoring availability with Eduvos staff and track tutoring hours for the weekly allocation.</w:t>
-      </w:r>
-    </w:p>
-    <w:p>
-      <w:pPr>
-        <w:spacing w:before="200" w:after="80"/>
-      </w:pPr>
-      <w:r>
-        <w:rPr>
-          <w:rFonts w:ascii="Calibri" w:hAnsi="Calibri"/>
-          <w:b/>
-          <w:color w:val="0F766E"/>
-          <w:sz w:val="21"/>
-        </w:rPr>
-        <w:t>CURRENT COMMUNITY EXPERIENCE</w:t>
-      </w:r>
-    </w:p>
-    <w:p>
-      <w:pPr>
-        <w:spacing w:after="20"/>
-      </w:pPr>
-      <w:r>
-        <w:rPr>
-          <w:rFonts w:ascii="Calibri" w:hAnsi="Calibri"/>
-          <w:b/>
-          <w:color w:val="111827"/>
-          <w:sz w:val="21"/>
-        </w:rPr>
-        <w:t>Nature's Valley Trust Community IT and Youth Ambassador Support</w:t>
-      </w:r>
-      <w:r>
-        <w:rPr>
-          <w:rFonts w:ascii="Calibri" w:hAnsi="Calibri"/>
-          <w:b w:val="0"/>
-          <w:color w:val="4B5563"/>
-          <w:sz w:val="18"/>
-        </w:rPr>
-        <w:t xml:space="preserve"> | Nature's Valley, South Africa | June 2026</w:t>
-      </w:r>
-    </w:p>
-    <w:p>
-      <w:pPr>
-        <w:pStyle w:val="ListBullet"/>
-        <w:spacing w:after="20"/>
-      </w:pPr>
-      <w:r>
-        <w:rPr>
-          <w:rFonts w:ascii="Calibri" w:hAnsi="Calibri"/>
-          <w:b w:val="0"/>
-          <w:color w:val="374151"/>
-          <w:sz w:val="18"/>
-        </w:rPr>
-        <w:t>Support Gavin on KuCoNa IT installation during Nature's Valley Trust coordination.</w:t>
-      </w:r>
-    </w:p>
-    <w:p>
-      <w:pPr>
-        <w:pStyle w:val="ListBullet"/>
-        <w:spacing w:after="20"/>
-      </w:pPr>
-      <w:r>
-        <w:rPr>
-          <w:rFonts w:ascii="Calibri" w:hAnsi="Calibri"/>
-          <w:b w:val="0"/>
-          <w:color w:val="374151"/>
-          <w:sz w:val="18"/>
-        </w:rPr>
-        <w:t>Coordinate with Andrew to meet 10 youth ambassadors ahead of their July 1, 2026 start.</w:t>
       </w:r>
     </w:p>
     <w:p>

</xml_diff>

<commit_message>
Add evidenced Nature's Valley portfolio copy
</commit_message>
<xml_diff>
--- a/Joshua_Nehohwa_CV.docx
+++ b/Joshua_Nehohwa_CV.docx
@@ -72,7 +72,7 @@
           <w:color w:val="374151"/>
           <w:sz w:val="19"/>
         </w:rPr>
-        <w:t>Software Engineering student and junior developer with experience across React/Next.js, TypeScript, Python, PHP/MySQL, Supabase, cloud fundamentals, and AI data evaluation. Strong academic performer with an 86% average, chairperson of Vossie DevClub, and current Eduvos tutor for ITMTA1-B22 students. Practical experience leading tutorial sessions, building product prototypes, and working remotely with detailed AI annotation guidelines.</w:t>
+        <w:t>Software Engineering student and junior developer with experience across React/Next.js, TypeScript, Python, PHP/MySQL, Supabase, cloud fundamentals, and AI data evaluation. Strong academic performer with an 86% average, chairperson of Vossie DevClub, and current Eduvos tutor for ITMTA1-B22 students. Practical experience leading tutorial sessions, supporting Nature's Valley community IT and youth-ambassador coordination, building product prototypes, and working remotely with detailed AI annotation guidelines.</w:t>
       </w:r>
     </w:p>
     <w:p>
@@ -290,6 +290,73 @@
           <w:sz w:val="18"/>
         </w:rPr>
         <w:t>Coordinate tutoring availability with Eduvos staff and track tutoring hours for the weekly allocation.</w:t>
+      </w:r>
+    </w:p>
+    <w:p>
+      <w:pPr>
+        <w:spacing w:before="200" w:after="80"/>
+      </w:pPr>
+      <w:r>
+        <w:rPr>
+          <w:rFonts w:ascii="Calibri" w:hAnsi="Calibri"/>
+          <w:b/>
+          <w:color w:val="0F766E"/>
+          <w:sz w:val="21"/>
+        </w:rPr>
+        <w:t>CURRENT COMMUNITY EXPERIENCE</w:t>
+      </w:r>
+    </w:p>
+    <w:p>
+      <w:pPr>
+        <w:spacing w:after="20"/>
+      </w:pPr>
+      <w:r>
+        <w:rPr>
+          <w:rFonts w:ascii="Calibri" w:hAnsi="Calibri"/>
+          <w:b/>
+          <w:color w:val="111827"/>
+          <w:sz w:val="21"/>
+        </w:rPr>
+        <w:t>Nature's Valley Trust Community IT and Youth Ambassador Support</w:t>
+      </w:r>
+      <w:r>
+        <w:rPr>
+          <w:rFonts w:ascii="Calibri" w:hAnsi="Calibri"/>
+          <w:b w:val="0"/>
+          <w:color w:val="4B5563"/>
+          <w:sz w:val="18"/>
+        </w:rPr>
+        <w:t xml:space="preserve"> | Nature's Valley, South Africa | June 2026</w:t>
+      </w:r>
+    </w:p>
+    <w:p>
+      <w:pPr>
+        <w:pStyle w:val="ListBullet"/>
+        <w:spacing w:after="20"/>
+      </w:pPr>
+      <w:r>
+        <w:rPr>
+          <w:rFonts w:ascii="Calibri" w:hAnsi="Calibri"/>
+          <w:b w:val="0"/>
+          <w:color w:val="374151"/>
+          <w:sz w:val="18"/>
+        </w:rPr>
+        <w:t>Support Gavin on KuCoNa IT installation during Nature's Valley Trust coordination.</w:t>
+      </w:r>
+    </w:p>
+    <w:p>
+      <w:pPr>
+        <w:pStyle w:val="ListBullet"/>
+        <w:spacing w:after="20"/>
+      </w:pPr>
+      <w:r>
+        <w:rPr>
+          <w:rFonts w:ascii="Calibri" w:hAnsi="Calibri"/>
+          <w:b w:val="0"/>
+          <w:color w:val="374151"/>
+          <w:sz w:val="18"/>
+        </w:rPr>
+        <w:t>Coordinate with Andrew to meet 10 youth ambassadors ahead of their July 1, 2026 start.</w:t>
       </w:r>
     </w:p>
     <w:p>

</xml_diff>

<commit_message>
Add KuCoNa portfolio and CV experience
</commit_message>
<xml_diff>
--- a/Joshua_Nehohwa_CV.docx
+++ b/Joshua_Nehohwa_CV.docx
@@ -72,7 +72,7 @@
           <w:color w:val="374151"/>
           <w:sz w:val="19"/>
         </w:rPr>
-        <w:t>Software Engineering student and junior developer with experience across React/Next.js, TypeScript, Python, PHP/MySQL, Supabase, cloud fundamentals, and AI data evaluation. Strong academic performer with an 86% average, chairperson of Vossie DevClub, and current Eduvos tutor for ITMTA1-B22 students. Practical experience leading tutorial sessions, supporting Nature's Valley community IT and youth-ambassador coordination, building product prototypes, and working remotely with detailed AI annotation guidelines.</w:t>
+        <w:t>Software Engineering student and junior developer with experience across React/Next.js, TypeScript, Python, PHP/MySQL, WordPress/Elementor, Airtable, Jotform, Make.com, Supabase, cloud fundamentals, and AI data evaluation. Strong academic performer with an 86% average, chairperson of Vossie DevClub, recent Digital Systems and Web Development Intern for Nature's Valley Trust / KuCoNa, and current Eduvos tutor for ITMTA1-B22 students.</w:t>
       </w:r>
     </w:p>
     <w:p>
@@ -161,7 +161,7 @@
           <w:color w:val="4B5563"/>
           <w:sz w:val="18"/>
         </w:rPr>
-        <w:t xml:space="preserve"> | Python, JavaScript, TypeScript, Visual Basic, Java, PHP</w:t>
+        <w:t xml:space="preserve"> | Python, JavaScript, TypeScript, HTML, CSS, Visual Basic, Java, PHP</w:t>
       </w:r>
     </w:p>
     <w:p>
@@ -184,7 +184,7 @@
           <w:color w:val="4B5563"/>
           <w:sz w:val="18"/>
         </w:rPr>
-        <w:t xml:space="preserve"> | React, Next.js, Node.js, Tailwind CSS, Supabase, Clerk Auth, Git, Linux, Docker basics, Figma, Justinmind</w:t>
+        <w:t xml:space="preserve"> | React, Next.js, Node.js, WordPress, Elementor, Tailwind CSS, Supabase, Clerk Auth, Git, Linux, Docker basics, Figma, Justinmind</w:t>
       </w:r>
     </w:p>
     <w:p>
@@ -198,7 +198,7 @@
           <w:color w:val="111827"/>
           <w:sz w:val="21"/>
         </w:rPr>
-        <w:t>Databases and cloud</w:t>
+        <w:t>Data, automation, and cloud</w:t>
       </w:r>
       <w:r>
         <w:rPr>
@@ -207,7 +207,134 @@
           <w:color w:val="4B5563"/>
           <w:sz w:val="18"/>
         </w:rPr>
-        <w:t xml:space="preserve"> | PostgreSQL, MySQL, Supabase, AWS EC2, S3, IAM, Lambda</w:t>
+        <w:t xml:space="preserve"> | PostgreSQL, MySQL, Airtable, Jotform, Make.com, Google Forms, Google Sheets, Google Apps Script, AWS EC2, S3, IAM, Lambda</w:t>
+      </w:r>
+    </w:p>
+    <w:p>
+      <w:pPr>
+        <w:spacing w:before="200" w:after="80"/>
+      </w:pPr>
+      <w:r>
+        <w:rPr>
+          <w:rFonts w:ascii="Calibri" w:hAnsi="Calibri"/>
+          <w:b/>
+          <w:color w:val="0F766E"/>
+          <w:sz w:val="21"/>
+        </w:rPr>
+        <w:t>RECENT INTERNSHIP EXPERIENCE</w:t>
+      </w:r>
+    </w:p>
+    <w:p>
+      <w:pPr>
+        <w:spacing w:after="20"/>
+      </w:pPr>
+      <w:r>
+        <w:rPr>
+          <w:rFonts w:ascii="Calibri" w:hAnsi="Calibri"/>
+          <w:b/>
+          <w:color w:val="111827"/>
+          <w:sz w:val="21"/>
+        </w:rPr>
+        <w:t>Digital Systems and Web Development Intern, Nature's Valley Trust / KuCoNa</w:t>
+      </w:r>
+      <w:r>
+        <w:rPr>
+          <w:rFonts w:ascii="Calibri" w:hAnsi="Calibri"/>
+          <w:b w:val="0"/>
+          <w:color w:val="4B5563"/>
+          <w:sz w:val="18"/>
+        </w:rPr>
+        <w:t xml:space="preserve"> | Nature's Valley, South Africa | 1 Jun 2026 - 1 Aug 2026</w:t>
+      </w:r>
+    </w:p>
+    <w:p>
+      <w:pPr>
+        <w:pStyle w:val="ListBullet"/>
+        <w:spacing w:after="20"/>
+      </w:pPr>
+      <w:r>
+        <w:rPr>
+          <w:rFonts w:ascii="Calibri" w:hAnsi="Calibri"/>
+          <w:b w:val="0"/>
+          <w:color w:val="374151"/>
+          <w:sz w:val="18"/>
+        </w:rPr>
+        <w:t>Built and launched a responsive WordPress/Elementor website for KuCoNa, covering three programme hubs, 15+ public pages, registration pathways, and a 14-partner directory.</w:t>
+      </w:r>
+    </w:p>
+    <w:p>
+      <w:pPr>
+        <w:pStyle w:val="ListBullet"/>
+        <w:spacing w:after="20"/>
+      </w:pPr>
+      <w:r>
+        <w:rPr>
+          <w:rFonts w:ascii="Calibri" w:hAnsi="Calibri"/>
+          <w:b w:val="0"/>
+          <w:color w:val="374151"/>
+          <w:sz w:val="18"/>
+        </w:rPr>
+        <w:t>Designed a privacy-conscious operations workflow connecting WordPress, Jotform, Make.com, and Airtable.</w:t>
+      </w:r>
+    </w:p>
+    <w:p>
+      <w:pPr>
+        <w:pStyle w:val="ListBullet"/>
+        <w:spacing w:after="20"/>
+      </w:pPr>
+      <w:r>
+        <w:rPr>
+          <w:rFonts w:ascii="Calibri" w:hAnsi="Calibri"/>
+          <w:b w:val="0"/>
+          <w:color w:val="374151"/>
+          <w:sz w:val="18"/>
+        </w:rPr>
+        <w:t>Configured and tested automated youth-registration intake, Airtable integration logging, attendance support, and duplicate-prevention fields.</w:t>
+      </w:r>
+    </w:p>
+    <w:p>
+      <w:pPr>
+        <w:pStyle w:val="ListBullet"/>
+        <w:spacing w:after="20"/>
+      </w:pPr>
+      <w:r>
+        <w:rPr>
+          <w:rFonts w:ascii="Calibri" w:hAnsi="Calibri"/>
+          <w:b w:val="0"/>
+          <w:color w:val="374151"/>
+          <w:sz w:val="18"/>
+        </w:rPr>
+        <w:t>Cleaned 1,037 demonstration records while preserving the live Airtable schema and integrations.</w:t>
+      </w:r>
+    </w:p>
+    <w:p>
+      <w:pPr>
+        <w:pStyle w:val="ListBullet"/>
+        <w:spacing w:after="20"/>
+      </w:pPr>
+      <w:r>
+        <w:rPr>
+          <w:rFonts w:ascii="Calibri" w:hAnsi="Calibri"/>
+          <w:b w:val="0"/>
+          <w:color w:val="374151"/>
+          <w:sz w:val="18"/>
+        </w:rPr>
+        <w:t>Developed a 47-question bilingual community survey with Google Forms, Apps Script, and linked Google Sheets analytics.</w:t>
+      </w:r>
+    </w:p>
+    <w:p>
+      <w:pPr>
+        <w:pStyle w:val="ListBullet"/>
+        <w:spacing w:after="20"/>
+      </w:pPr>
+      <w:r>
+        <w:rPr>
+          <w:rFonts w:ascii="Calibri" w:hAnsi="Calibri"/>
+          <w:b w:val="0"/>
+          <w:color w:val="374151"/>
+          <w:sz w:val="18"/>
+        </w:rPr>
+        <w:t>Created technical documentation, implementation checklists, and staff training resources to support organisational handover.</w:t>
       </w:r>
     </w:p>
     <w:p>
@@ -290,73 +417,6 @@
           <w:sz w:val="18"/>
         </w:rPr>
         <w:t>Coordinate tutoring availability with Eduvos staff and track tutoring hours for the weekly allocation.</w:t>
-      </w:r>
-    </w:p>
-    <w:p>
-      <w:pPr>
-        <w:spacing w:before="200" w:after="80"/>
-      </w:pPr>
-      <w:r>
-        <w:rPr>
-          <w:rFonts w:ascii="Calibri" w:hAnsi="Calibri"/>
-          <w:b/>
-          <w:color w:val="0F766E"/>
-          <w:sz w:val="21"/>
-        </w:rPr>
-        <w:t>CURRENT COMMUNITY EXPERIENCE</w:t>
-      </w:r>
-    </w:p>
-    <w:p>
-      <w:pPr>
-        <w:spacing w:after="20"/>
-      </w:pPr>
-      <w:r>
-        <w:rPr>
-          <w:rFonts w:ascii="Calibri" w:hAnsi="Calibri"/>
-          <w:b/>
-          <w:color w:val="111827"/>
-          <w:sz w:val="21"/>
-        </w:rPr>
-        <w:t>Nature's Valley Trust Community IT and Youth Ambassador Support</w:t>
-      </w:r>
-      <w:r>
-        <w:rPr>
-          <w:rFonts w:ascii="Calibri" w:hAnsi="Calibri"/>
-          <w:b w:val="0"/>
-          <w:color w:val="4B5563"/>
-          <w:sz w:val="18"/>
-        </w:rPr>
-        <w:t xml:space="preserve"> | Nature's Valley, South Africa | June 2026</w:t>
-      </w:r>
-    </w:p>
-    <w:p>
-      <w:pPr>
-        <w:pStyle w:val="ListBullet"/>
-        <w:spacing w:after="20"/>
-      </w:pPr>
-      <w:r>
-        <w:rPr>
-          <w:rFonts w:ascii="Calibri" w:hAnsi="Calibri"/>
-          <w:b w:val="0"/>
-          <w:color w:val="374151"/>
-          <w:sz w:val="18"/>
-        </w:rPr>
-        <w:t>Support Gavin on KuCoNa IT installation during Nature's Valley Trust coordination.</w:t>
-      </w:r>
-    </w:p>
-    <w:p>
-      <w:pPr>
-        <w:pStyle w:val="ListBullet"/>
-        <w:spacing w:after="20"/>
-      </w:pPr>
-      <w:r>
-        <w:rPr>
-          <w:rFonts w:ascii="Calibri" w:hAnsi="Calibri"/>
-          <w:b w:val="0"/>
-          <w:color w:val="374151"/>
-          <w:sz w:val="18"/>
-        </w:rPr>
-        <w:t>Coordinate with Andrew to meet 10 youth ambassadors ahead of their July 1, 2026 start.</w:t>
       </w:r>
     </w:p>
     <w:p>

</xml_diff>